<commit_message>
Update the ROI figures to the full in-scope population
Both notes/roi.md and the one-pager reported R = 55.09% from the original
50-batch Lab 6 sample. The agent has since been run over the full 370-batch
in-scope population (excluding the ten designed test batches, same as the
sample did), giving R = 46.78%, computed by tools/roi.py the same way as
before.

notes/roi.md keeps the original Lab 6 sample record intact and adds a dated
update section below it, rather than overwriting a record tied to specific
journal decisions. The one-pager's ROI bullets, its Testing and Views
bullets (which described a now-superseded 60-batch/side-by-side dashboard
state), and its Known limits are updated to match the current numbers and
the current dashboard (sortable, ROI panel, location breakdown, approval
audit trail). Still fits one page.

Co-Authored-By: Claude Sonnet 5 <noreply@anthropic.com>
</commit_message>
<xml_diff>
--- a/Shelf-Life-Clock-one-pager.docx
+++ b/Shelf-Life-Clock-one-pager.docx
@@ -222,7 +222,7 @@
           <w:color w:val="1F2933"/>
           <w:sz w:val="19"/>
         </w:rPr>
-        <w:t>dashboard.html shows the Claude Code run and the API run side by side; tools/serve.py is a local live version that runs chosen batches from the page.</w:t>
+        <w:t>dashboard.html is sortable and shows the API run's queue, an ROI panel, a by-location breakdown, and an approval audit trail for HOLD batches (signing off never changes status or the real send check). tools/serve.py is a local live version that runs batches, and accepts approvals, from the page.</w:t>
       </w:r>
     </w:p>
     <w:p>
@@ -925,7 +925,7 @@
           <w:color w:val="1F2933"/>
           <w:sz w:val="19"/>
         </w:rPr>
-        <w:t>10 designed edge-case batches: 10 of 10 matched the answer key. The send test passed: the READY brief went out and the "everything" brief was blocked by the safety check. Across 60 batches (10 designed plus a 50-batch random sample, seed 7) the queue was 45 READY, 8 HOLD, 7 MONITOR; the API run matched the Claude Code run on action, status and approver for 60 of 60, and on clause IDs exactly for 13 of 60 (the rest differ by extra context clauses).</w:t>
+        <w:t>10 designed edge-case batches: 10 of 10 matched the answer key. The send test passed: the READY brief went out and the "everything" brief was blocked by the safety check. On an initial 60-batch check the API run matched the Claude Code run on action, status and approver for 60 of 60, and on clause IDs for 13 of 60 (the rest differ by extra context clauses). Since run over the full in-scope inventory: 380 batches, 269 READY, 43 HOLD, 68 MONITOR.</w:t>
       </w:r>
     </w:p>
     <w:p>
@@ -950,7 +950,7 @@
           <w:color w:val="1F2933"/>
           <w:sz w:val="19"/>
         </w:rPr>
-        <w:t xml:space="preserve">Value at risk = V × u. Recovery rates (REF-FIN-02): transfer 90%, return 80% (food) or 90% (healthcare), markdown 60%, dispose and monitor 0%. </w:t>
+        <w:t xml:space="preserve">Value at risk = V × u. Recovery rates (REF-FIN-02): transfer 90%, return 80% (food) or 90% (healthcare), markdown 60%, dispose and monitor 0%. Computed over the full 370-batch in-scope population (all in-scope batches except the ten designed test ones, excluded the same way the original sample excluded them): </w:t>
       </w:r>
       <w:r>
         <w:rPr>
@@ -959,7 +959,16 @@
           <w:color w:val="1F2933"/>
           <w:sz w:val="19"/>
         </w:rPr>
-        <w:t>R = Σ(recovered) ÷ Σ(value at risk) = $5,746.68 ÷ $10,432.16 = 55.09%.</w:t>
+        <w:t>R = Σ(recovered) ÷ Σ(value at risk) = $41,514.17 ÷ $88,741.19 = 46.78%.</w:t>
+      </w:r>
+      <w:r>
+        <w:rPr>
+          <w:rFonts w:ascii="Calibri" w:hAnsi="Calibri"/>
+          <w:b w:val="0"/>
+          <w:color w:val="1F2933"/>
+          <w:sz w:val="19"/>
+        </w:rPr>
+        <w:t xml:space="preserve"> This replaces an earlier 50-batch sample estimate of 55.09%; the fuller number is lower, not higher.</w:t>
       </w:r>
     </w:p>
     <w:p>
@@ -993,7 +1002,7 @@
           <w:color w:val="1F2933"/>
           <w:sz w:val="19"/>
         </w:rPr>
-        <w:t>about $61,150 a year</w:t>
+        <w:t>about $51,927 a year</w:t>
       </w:r>
       <w:r>
         <w:rPr>
@@ -1002,7 +1011,7 @@
           <w:color w:val="1F2933"/>
           <w:sz w:val="19"/>
         </w:rPr>
-        <w:t xml:space="preserve"> (E = 40%: $40,767; E = 80%: $81,533). Break-even needs R × E above cost ÷ $185,000: 27.03% at $50,000 a year (base case 33.05% clears it) and 54.05% at $100,000 (it does not). One wrong action on a $12,000 batch erases 2.35 months of base-case savings.</w:t>
+        <w:t xml:space="preserve"> (E = 40%: $34,618; E = 80%: $69,236). Break-even needs R × E above cost ÷ $185,000: 27.03% at $50,000 a year (base case 28.07% clears it, but by only about one point, not the six-point margin the sample suggested) and 54.05% at $100,000 (no case tested clears it). One wrong action on the $12,000 batch (LF-70001) now erases 2.77 months of base-case savings.</w:t>
       </w:r>
     </w:p>
     <w:p>
@@ -1035,7 +1044,7 @@
           <w:color w:val="5B6770"/>
           <w:sz w:val="19"/>
         </w:rPr>
-        <w:t>Recovery rates and the $185,000 baseline come from made-up policy, not measurement. E is assumed, and it is the assumption most likely to break the result. R rests on a 50-batch sample. Reading REF-ACT-01 so that u &lt; 0.10 overrides other eligible actions is a judgement call. The API run's approver match checks the rule code, not the model. The send hook only watches the Bash tool.</w:t>
+        <w:t>Recovery rates and the $185,000 baseline come from made-up policy, not measurement; E is the assumption most likely to break the result. R now rests on the full in-scope population, but its recovery rates are still fictional planning figures. Reading REF-ACT-01 so that u &lt; 0.10 overrides other eligible actions is a judgement call. The approver match checks the rule code, not the model; the send hook only watches the Bash tool; and the approval workflow's name field is typed, not authenticated.</w:t>
       </w:r>
     </w:p>
     <w:sectPr>

</xml_diff>